<commit_message>
Update résumé wording: replace 82%-93% pass rate stat with 100% Pre-Board to Board progression
Co-Authored-By: Claude Sonnet 4.6 <noreply@anthropic.com>
</commit_message>
<xml_diff>
--- a/assets/files/Abhishek-Banerjee-Resume.docx
+++ b/assets/files/Abhishek-Banerjee-Resume.docx
@@ -235,7 +235,7 @@
                 <w:sz w:val="28"/>
                 <w:szCs w:val="28"/>
               </w:rPr>
-              <w:t xml:space="preserve">82% to 93%</w:t>
+              <w:t xml:space="preserve">100%</w:t>
             </w:r>
           </w:p>
           <w:p>
@@ -250,7 +250,7 @@
                 <w:sz w:val="15"/>
                 <w:szCs w:val="15"/>
               </w:rPr>
-              <w:t xml:space="preserve">Board pass rate improvement</w:t>
+              <w:t xml:space="preserve">Pre-Board to Board progression</w:t>
             </w:r>
           </w:p>
         </w:tc>
@@ -396,7 +396,7 @@
           <w:sz w:val="20"/>
           <w:szCs w:val="20"/>
         </w:rPr>
-        <w:t xml:space="preserve">A dynamic and visionary CBSE school leader with 21 years of K-12 academic and administrative leadership, including oversight of institutions serving 10,000+ students. Proven record of improving board pass rates (82% to 93%), managing full CBSE regulatory compliance, and building faculty development and succession pipelines across large, multi-department schools. Appointed CBSE Resource Person, Skill Department (2025) — one of fewer than 200 nationally — contributing to curriculum reform and competency-based teacher training across North India. Combines academic rigour with operational accountability across admissions, infrastructure, brand building, stakeholder management, and a demonstrated record of driving institutional growth through academic excellence and community trust.</w:t>
+        <w:t xml:space="preserve">A dynamic and visionary CBSE school leader with 21 years of K-12 academic and administrative leadership, including oversight of institutions serving 10,000+ students. Proven record of taking the Pre-Board-to-Board student progression rate to 100%, managing full CBSE regulatory compliance, and building faculty development and succession pipelines across large, multi-department schools. Appointed CBSE Resource Person, Skill Department (2025) — one of fewer than 200 nationally — contributing to curriculum reform and competency-based teacher training across North India. Combines academic rigour with operational accountability across admissions, infrastructure, brand building, stakeholder management, and a demonstrated record of driving institutional growth through academic excellence and community trust.</w:t>
       </w:r>
     </w:p>
     <w:p>

</xml_diff>